<commit_message>
Fix GitHub Pages subpath asset paths (unstyled articles); add mega menu, translations category pages, restyle index-new
</commit_message>
<xml_diff>
--- a/docs/downloads/john-gifford-bellett/doc_0275.docx
+++ b/docs/downloads/john-gifford-bellett/doc_0275.docx
@@ -1,26 +1,35 @@
 
 <file path=word/document.xml><?xml version="1.0" encoding="utf-8"?>
-<w:document xmlns:wpc="http://schemas.microsoft.com/office/word/2010/wordprocessingCanvas" xmlns:cx="http://schemas.microsoft.com/office/drawing/2014/chartex" xmlns:cx1="http://schemas.microsoft.com/office/drawing/2015/9/8/chartex" xmlns:cx2="http://schemas.microsoft.com/office/drawing/2015/10/21/chartex" xmlns:cx3="http://schemas.microsoft.com/office/drawing/2016/5/9/chartex" xmlns:cx4="http://schemas.microsoft.com/office/drawing/2016/5/10/chartex" xmlns:cx5="http://schemas.microsoft.com/office/drawing/2016/5/11/chartex" xmlns:cx6="http://schemas.microsoft.com/office/drawing/2016/5/12/chartex" xmlns:cx7="http://schemas.microsoft.com/office/drawing/2016/5/13/chartex" xmlns:cx8="http://schemas.microsoft.com/office/drawing/2016/5/14/chartex" xmlns:mc="http://schemas.openxmlformats.org/markup-compatibility/2006" xmlns:aink="http://schemas.microsoft.com/office/drawing/2016/ink" xmlns:am3d="http://schemas.microsoft.com/office/drawing/2017/model3d" xmlns:o="urn:schemas-microsoft-com:office:office" xmlns:oel="http://schemas.microsoft.com/office/2019/extlst" xmlns:r="http://schemas.openxmlformats.org/officeDocument/2006/relationships" xmlns:m="http://schemas.openxmlformats.org/officeDocument/2006/math" xmlns:v="urn:schemas-microsoft-com:vml" xmlns:wp14="http://schemas.microsoft.com/office/word/2010/wordprocessingDrawing" xmlns:wp="http://schemas.openxmlformats.org/drawingml/2006/wordprocessingDrawing" xmlns:w10="urn:schemas-microsoft-com:office:word" xmlns:w="http://schemas.openxmlformats.org/wordprocessingml/2006/main" xmlns:w14="http://schemas.microsoft.com/office/word/2010/wordml" xmlns:w15="http://schemas.microsoft.com/office/word/2012/wordml" xmlns:w16cex="http://schemas.microsoft.com/office/word/2018/wordml/cex" xmlns:w16cid="http://schemas.microsoft.com/office/word/2016/wordml/cid" xmlns:w16="http://schemas.microsoft.com/office/word/2018/wordml" xmlns:w16sdtdh="http://schemas.microsoft.com/office/word/2020/wordml/sdtdatahash" xmlns:w16se="http://schemas.microsoft.com/office/word/2015/wordml/symex" xmlns:wpg="http://schemas.microsoft.com/office/word/2010/wordprocessingGroup" xmlns:wpi="http://schemas.microsoft.com/office/word/2010/wordprocessingInk" xmlns:wne="http://schemas.microsoft.com/office/word/2006/wordml" xmlns:wps="http://schemas.microsoft.com/office/word/2010/wordprocessingShape" mc:Ignorable="w14 w15 w16se w16cid w16 w16cex w16sdtdh wp14">
+<w:document xmlns:wpc="http://schemas.microsoft.com/office/word/2010/wordprocessingCanvas" xmlns:cx="http://schemas.microsoft.com/office/drawing/2014/chartex" xmlns:cx1="http://schemas.microsoft.com/office/drawing/2015/9/8/chartex" xmlns:cx2="http://schemas.microsoft.com/office/drawing/2015/10/21/chartex" xmlns:cx3="http://schemas.microsoft.com/office/drawing/2016/5/9/chartex" xmlns:cx4="http://schemas.microsoft.com/office/drawing/2016/5/10/chartex" xmlns:cx5="http://schemas.microsoft.com/office/drawing/2016/5/11/chartex" xmlns:cx6="http://schemas.microsoft.com/office/drawing/2016/5/12/chartex" xmlns:cx7="http://schemas.microsoft.com/office/drawing/2016/5/13/chartex" xmlns:cx8="http://schemas.microsoft.com/office/drawing/2016/5/14/chartex" xmlns:mc="http://schemas.openxmlformats.org/markup-compatibility/2006" xmlns:aink="http://schemas.microsoft.com/office/drawing/2016/ink" xmlns:am3d="http://schemas.microsoft.com/office/drawing/2017/model3d" xmlns:o="urn:schemas-microsoft-com:office:office" xmlns:oel="http://schemas.microsoft.com/office/2019/extlst" xmlns:r="http://schemas.openxmlformats.org/officeDocument/2006/relationships" xmlns:m="http://schemas.openxmlformats.org/officeDocument/2006/math" xmlns:v="urn:schemas-microsoft-com:vml" xmlns:wp14="http://schemas.microsoft.com/office/word/2010/wordprocessingDrawing" xmlns:wp="http://schemas.openxmlformats.org/drawingml/2006/wordprocessingDrawing" xmlns:w10="urn:schemas-microsoft-com:office:word" xmlns:w="http://schemas.openxmlformats.org/wordprocessingml/2006/main" xmlns:w14="http://schemas.microsoft.com/office/word/2010/wordml" xmlns:w15="http://schemas.microsoft.com/office/word/2012/wordml" xmlns:w16cex="http://schemas.microsoft.com/office/word/2018/wordml/cex" xmlns:w16cid="http://schemas.microsoft.com/office/word/2016/wordml/cid" xmlns:w16="http://schemas.microsoft.com/office/word/2018/wordml" xmlns:w16du="http://schemas.microsoft.com/office/word/2023/wordml/word16du" xmlns:w16sdtdh="http://schemas.microsoft.com/office/word/2020/wordml/sdtdatahash" xmlns:w16sdtfl="http://schemas.microsoft.com/office/word/2024/wordml/sdtformatlock" xmlns:w16se="http://schemas.microsoft.com/office/word/2015/wordml/symex" xmlns:wpg="http://schemas.microsoft.com/office/word/2010/wordprocessingGroup" xmlns:wpi="http://schemas.microsoft.com/office/word/2010/wordprocessingInk" xmlns:wne="http://schemas.microsoft.com/office/word/2006/wordml" xmlns:wps="http://schemas.microsoft.com/office/word/2010/wordprocessingShape" mc:Ignorable="w14 w15 w16se w16cid w16 w16cex w16sdtdh w16sdtfl w16du wp14">
   <w:body>
     <w:p>
       <w:pPr>
         <w:rPr>
-          <w:rFonts w:hint="cs"/>
           <w:rtl/>
           <w:lang w:bidi="ar-SA"/>
         </w:rPr>
       </w:pPr>
-      <w:hyperlink r:id="rId4" w:history="1">
-        <w:r>
-          <w:rPr>
-            <w:rStyle w:val="Hyperlink"/>
-            <w:rFonts w:hint="cs"/>
-            <w:rtl/>
-            <w:lang w:bidi="ar-SA"/>
-          </w:rPr>
-          <w:t>ترضيات</w:t>
-        </w:r>
-      </w:hyperlink>
+      <w:r>
+        <w:fldChar w:fldCharType="begin"/>
+      </w:r>
+      <w:r>
+        <w:instrText>HYPERLINK "https://www.soundwords.de/gefaelligkeiten-a8525.html"</w:instrText>
+      </w:r>
+      <w:r>
+        <w:fldChar w:fldCharType="separate"/>
+      </w:r>
+      <w:r>
+        <w:rPr>
+          <w:rStyle w:val="Hyperlink"/>
+          <w:rFonts w:hint="cs"/>
+          <w:rtl/>
+          <w:lang w:bidi="ar-SA"/>
+        </w:rPr>
+        <w:t>ترضيات</w:t>
+      </w:r>
+      <w:r>
+        <w:fldChar w:fldCharType="end"/>
+      </w:r>
     </w:p>
     <w:p>
       <w:pPr>
@@ -87,7 +96,23 @@
           <w:rtl/>
           <w:lang w:bidi="ar-SA"/>
         </w:rPr>
-        <w:t>لأَنَّ الْمَسِيحَ أَيْضًا لَمْ يُرْضِ نَفْسَهُ، بَلْ كَمَا هُوَ مَكْتُوبٌ:«تَعْيِيرَاتُ مُعَيِّرِيكَ وَقَعَتْ عَلَيَّ».</w:t>
+        <w:t xml:space="preserve">لأَنَّ الْمَسِيحَ أَيْضًا لَمْ يُرْضِ نَفْسَهُ، بَلْ كَمَا هُوَ </w:t>
+      </w:r>
+      <w:proofErr w:type="gramStart"/>
+      <w:r>
+        <w:rPr>
+          <w:rtl/>
+          <w:lang w:bidi="ar-SA"/>
+        </w:rPr>
+        <w:t>مَكْتُوبٌ:«</w:t>
+      </w:r>
+      <w:proofErr w:type="gramEnd"/>
+      <w:r>
+        <w:rPr>
+          <w:rtl/>
+          <w:lang w:bidi="ar-SA"/>
+        </w:rPr>
+        <w:t>تَعْيِيرَاتُ مُعَيِّرِيكَ وَقَعَتْ عَلَيَّ».</w:t>
       </w:r>
       <w:r>
         <w:rPr>
@@ -239,7 +264,7 @@
         </w:rPr>
         <w:t xml:space="preserve">أدان أحدًا بعجلة. ولم يكن بقدرة أحد أن يجعله رحيمًا بالإطراء، ولا أن يتحداه بأن يتصرف من دون </w:t>
       </w:r>
-      <w:hyperlink r:id="rId5" w:anchor=":~:text=lieblos%20zu%20handeln.-,Betrachten%20wir,-Lukas%2022%2C24%2D30" w:history="1">
+      <w:hyperlink r:id="rId4" w:anchor=":~:text=lieblos%20zu%20handeln.-,Betrachten%20wir,-Lukas%2022%2C24%2D30" w:history="1">
         <w:r>
           <w:rPr>
             <w:rStyle w:val="Hyperlink"/>
@@ -262,7 +287,6 @@
     <w:p>
       <w:pPr>
         <w:rPr>
-          <w:rFonts w:hint="cs"/>
           <w:lang w:bidi="ar-SA"/>
         </w:rPr>
       </w:pPr>
@@ -278,7 +302,7 @@
 </file>
 
 <file path=word/styles.xml><?xml version="1.0" encoding="utf-8"?>
-<w:styles xmlns:mc="http://schemas.openxmlformats.org/markup-compatibility/2006" xmlns:r="http://schemas.openxmlformats.org/officeDocument/2006/relationships" xmlns:w="http://schemas.openxmlformats.org/wordprocessingml/2006/main" xmlns:w14="http://schemas.microsoft.com/office/word/2010/wordml" xmlns:w15="http://schemas.microsoft.com/office/word/2012/wordml" xmlns:w16cex="http://schemas.microsoft.com/office/word/2018/wordml/cex" xmlns:w16cid="http://schemas.microsoft.com/office/word/2016/wordml/cid" xmlns:w16="http://schemas.microsoft.com/office/word/2018/wordml" xmlns:w16sdtdh="http://schemas.microsoft.com/office/word/2020/wordml/sdtdatahash" xmlns:w16se="http://schemas.microsoft.com/office/word/2015/wordml/symex" mc:Ignorable="w14 w15 w16se w16cid w16 w16cex w16sdtdh">
+<w:styles xmlns:mc="http://schemas.openxmlformats.org/markup-compatibility/2006" xmlns:r="http://schemas.openxmlformats.org/officeDocument/2006/relationships" xmlns:w="http://schemas.openxmlformats.org/wordprocessingml/2006/main" xmlns:w14="http://schemas.microsoft.com/office/word/2010/wordml" xmlns:w15="http://schemas.microsoft.com/office/word/2012/wordml" xmlns:w16cex="http://schemas.microsoft.com/office/word/2018/wordml/cex" xmlns:w16cid="http://schemas.microsoft.com/office/word/2016/wordml/cid" xmlns:w16="http://schemas.microsoft.com/office/word/2018/wordml" xmlns:w16du="http://schemas.microsoft.com/office/word/2023/wordml/word16du" xmlns:w16sdtdh="http://schemas.microsoft.com/office/word/2020/wordml/sdtdatahash" xmlns:w16sdtfl="http://schemas.microsoft.com/office/word/2024/wordml/sdtformatlock" xmlns:w16se="http://schemas.microsoft.com/office/word/2015/wordml/symex" mc:Ignorable="w14 w15 w16se w16cid w16 w16cex w16sdtdh w16sdtfl w16du">
   <w:docDefaults>
     <w:rPrDefault>
       <w:rPr>
@@ -678,7 +702,6 @@
     <w:name w:val="Normal"/>
     <w:qFormat/>
     <w:rPr>
-      <w:noProof/>
       <w:lang w:bidi="ar-EG"/>
     </w:rPr>
   </w:style>

</xml_diff>